<commit_message>
Cierra el video con la petición dictada por el autor
Faltaba lo único que el video pedía y ahora está: regular para asegurar el
bienestar de los perros y rechazar la prohibición.

La formulación del autor resuelve el vacío mejor que la que se había
propuesto, porque invierte el marco de toda la campaña. El reproche
permanente es que quien defiende la actividad está contra los perros; esta
frase sostiene lo contrario en el mismo idioma del adversario: quien vota la
regulación es quien asegura el bienestar del animal, mientras que la
prohibición lo manda donde nadie puede exigir nada.

La petición entra antes del remate, y se repite en tres palabras como última
frase del video para que sea lo último que quede sonando.

Co-Authored-By: Claude Opus 5 <noreply@anthropic.com>
Claude-Session: https://claude.ai/code/session_01AaVqn5UHdydzFXx9WZark1
</commit_message>
<xml_diff>
--- a/03-borradores/Video-completo-unificado.docx
+++ b/03-borradores/Video-completo-unificado.docx
@@ -598,6 +598,85 @@
       <w:r>
         <w:rPr>
           <w:rFonts w:ascii="Calibri" w:cs="Calibri" w:eastAsia="Calibri" w:hAnsi="Calibri"/>
+          <w:b w:val="false"/>
+          <w:bCs w:val="false"/>
+          <w:sz w:val="34"/>
+          <w:szCs w:val="34"/>
+        </w:rPr>
+        <w:t xml:space="preserve">Y termino con lo práctico.</w:t>
+      </w:r>
+    </w:p>
+    <w:p>
+      <w:pPr>
+        <w:spacing w:after="280" w:before="0" w:line="420"/>
+      </w:pPr>
+      <w:r>
+        <w:rPr>
+          <w:rFonts w:ascii="Calibri" w:cs="Calibri" w:eastAsia="Calibri" w:hAnsi="Calibri"/>
+          <w:b w:val="false"/>
+          <w:bCs w:val="false"/>
+          <w:sz w:val="34"/>
+          <w:szCs w:val="34"/>
+        </w:rPr>
+        <w:t xml:space="preserve">Ese mismo día, en esa misma sesión, van dos proyectos. Uno prohíbe. El otro regula.</w:t>
+      </w:r>
+    </w:p>
+    <w:p>
+      <w:pPr>
+        <w:spacing w:after="280" w:before="0" w:line="420"/>
+      </w:pPr>
+      <w:r>
+        <w:rPr>
+          <w:rFonts w:ascii="Calibri" w:cs="Calibri" w:eastAsia="Calibri" w:hAnsi="Calibri"/>
+          <w:b/>
+          <w:bCs/>
+          <w:sz w:val="34"/>
+          <w:szCs w:val="34"/>
+        </w:rPr>
+        <w:t xml:space="preserve">Regula para asegurar el bienestar de los perritos. Y rechaza prohibir.</w:t>
+      </w:r>
+    </w:p>
+    <w:p>
+      <w:pPr>
+        <w:spacing w:after="280" w:before="0" w:line="420"/>
+      </w:pPr>
+      <w:r>
+        <w:rPr>
+          <w:rFonts w:ascii="Calibri" w:cs="Calibri" w:eastAsia="Calibri" w:hAnsi="Calibri"/>
+          <w:b w:val="false"/>
+          <w:bCs w:val="false"/>
+          <w:sz w:val="34"/>
+          <w:szCs w:val="34"/>
+        </w:rPr>
+        <w:t xml:space="preserve">Así no votas contra nadie. Votas a favor de que haya un veterinario en cada competencia, control de dopaje, pistas seguras, y clausura para el que no cumpla.</w:t>
+      </w:r>
+    </w:p>
+    <w:p>
+      <w:pPr>
+        <w:pBdr>
+          <w:bottom w:val="single" w:color="1F3864" w:sz="8" w:space="4"/>
+        </w:pBdr>
+        <w:spacing w:after="200" w:before="340"/>
+      </w:pPr>
+      <w:r>
+        <w:rPr>
+          <w:rFonts w:ascii="Calibri" w:cs="Calibri" w:eastAsia="Calibri" w:hAnsi="Calibri"/>
+          <w:b/>
+          <w:bCs/>
+          <w:color w:val="1F3864"/>
+          <w:sz w:val="26"/>
+          <w:szCs w:val="26"/>
+        </w:rPr>
+        <w:t xml:space="preserve">VI</w:t>
+      </w:r>
+    </w:p>
+    <w:p>
+      <w:pPr>
+        <w:spacing w:after="280" w:before="0" w:line="420"/>
+      </w:pPr>
+      <w:r>
+        <w:rPr>
+          <w:rFonts w:ascii="Calibri" w:cs="Calibri" w:eastAsia="Calibri" w:hAnsi="Calibri"/>
           <w:b/>
           <w:bCs/>
           <w:sz w:val="34"/>
@@ -649,6 +728,21 @@
           <w:szCs w:val="34"/>
         </w:rPr>
         <w:t xml:space="preserve">Y la gente, cuando vota, vota con su corazón y con su sentido común.</w:t>
+      </w:r>
+    </w:p>
+    <w:p>
+      <w:pPr>
+        <w:spacing w:after="280" w:before="0" w:line="420"/>
+      </w:pPr>
+      <w:r>
+        <w:rPr>
+          <w:rFonts w:ascii="Calibri" w:cs="Calibri" w:eastAsia="Calibri" w:hAnsi="Calibri"/>
+          <w:b/>
+          <w:bCs/>
+          <w:sz w:val="34"/>
+          <w:szCs w:val="34"/>
+        </w:rPr>
+        <w:t xml:space="preserve">Regula. Y rechaza prohibir.</w:t>
       </w:r>
     </w:p>
     <w:p>
@@ -706,171 +800,77 @@
           <w:sz w:val="26"/>
           <w:szCs w:val="26"/>
         </w:rPr>
-        <w:t xml:space="preserve">1. Falta lo único que le estás pidiendo</w:t>
-      </w:r>
-    </w:p>
-    <w:p>
-      <w:pPr>
-        <w:spacing w:after="280" w:before="0" w:line="420"/>
-      </w:pPr>
-      <w:r>
-        <w:rPr>
-          <w:rFonts w:ascii="Calibri" w:cs="Calibri" w:eastAsia="Calibri" w:hAnsi="Calibri"/>
-          <w:b/>
-          <w:bCs/>
-          <w:sz w:val="22"/>
-          <w:szCs w:val="22"/>
-        </w:rPr>
-        <w:t xml:space="preserve">En todo el video no hay petición.</w:t>
-      </w:r>
-      <w:r>
-        <w:rPr>
-          <w:rFonts w:ascii="Calibri" w:cs="Calibri" w:eastAsia="Calibri" w:hAnsi="Calibri"/>
-          <w:b w:val="false"/>
-          <w:bCs w:val="false"/>
-          <w:sz w:val="22"/>
-          <w:szCs w:val="22"/>
-        </w:rPr>
-        <w:t xml:space="preserve"> No le dices en ningún momento qué tiene que votar.</w:t>
-      </w:r>
-    </w:p>
-    <w:p>
-      <w:pPr>
-        <w:spacing w:after="280" w:before="0" w:line="420"/>
-      </w:pPr>
-      <w:r>
-        <w:rPr>
-          <w:rFonts w:ascii="Calibri" w:cs="Calibri" w:eastAsia="Calibri" w:hAnsi="Calibri"/>
-          <w:b w:val="false"/>
-          <w:bCs w:val="false"/>
-          <w:sz w:val="22"/>
-          <w:szCs w:val="22"/>
-        </w:rPr>
-        <w:t xml:space="preserve">Le explicas quién está detrás, le desmontas las acusaciones, le muestras la selectividad y le dices a quién escuchar. Pero nunca le dices </w:t>
-      </w:r>
-      <w:r>
-        <w:rPr>
-          <w:rFonts w:ascii="Calibri" w:cs="Calibri" w:eastAsia="Calibri" w:hAnsi="Calibri"/>
-          <w:b/>
-          <w:bCs/>
-          <w:sz w:val="22"/>
-          <w:szCs w:val="22"/>
-        </w:rPr>
-        <w:t xml:space="preserve">rechaza el que prohíbe y aprueba el que regula.</w:t>
-      </w:r>
-    </w:p>
-    <w:p>
-      <w:pPr>
-        <w:spacing w:after="280" w:before="0" w:line="420"/>
-      </w:pPr>
-      <w:r>
-        <w:rPr>
-          <w:rFonts w:ascii="Calibri" w:cs="Calibri" w:eastAsia="Calibri" w:hAnsi="Calibri"/>
-          <w:b w:val="false"/>
-          <w:bCs w:val="false"/>
-          <w:sz w:val="22"/>
-          <w:szCs w:val="22"/>
-        </w:rPr>
-        <w:t xml:space="preserve">Es el hueco más grande de la pieza. Un video que convence y no pide, no mueve el voto: deja al diputado de acuerdo contigo y sin instrucción.</w:t>
-      </w:r>
-    </w:p>
-    <w:p>
-      <w:pPr>
-        <w:spacing w:after="280" w:before="0" w:line="420"/>
-      </w:pPr>
-      <w:r>
-        <w:rPr>
-          <w:rFonts w:ascii="Calibri" w:cs="Calibri" w:eastAsia="Calibri" w:hAnsi="Calibri"/>
-          <w:b w:val="false"/>
-          <w:bCs w:val="false"/>
-          <w:sz w:val="22"/>
-          <w:szCs w:val="22"/>
-        </w:rPr>
-        <w:t xml:space="preserve">Además, la regulación aparece en el §IV </w:t>
-      </w:r>
-      <w:r>
-        <w:rPr>
-          <w:rFonts w:ascii="Calibri" w:cs="Calibri" w:eastAsia="Calibri" w:hAnsi="Calibri"/>
-          <w:b/>
-          <w:bCs/>
-          <w:sz w:val="22"/>
-          <w:szCs w:val="22"/>
-        </w:rPr>
-        <w:t xml:space="preserve">solo para discutir su financiamiento</w:t>
-      </w:r>
-      <w:r>
-        <w:rPr>
-          <w:rFonts w:ascii="Calibri" w:cs="Calibri" w:eastAsia="Calibri" w:hAnsi="Calibri"/>
-          <w:b w:val="false"/>
-          <w:bCs w:val="false"/>
-          <w:sz w:val="22"/>
-          <w:szCs w:val="22"/>
-        </w:rPr>
-        <w:t xml:space="preserve">, así que el que escucha ni siquiera se entera de que existe un segundo proyecto votable ese mismo día.</w:t>
-      </w:r>
-    </w:p>
-    <w:p>
-      <w:pPr>
-        <w:spacing w:after="280" w:before="0" w:line="420"/>
-      </w:pPr>
-      <w:r>
-        <w:rPr>
-          <w:rFonts w:ascii="Calibri" w:cs="Calibri" w:eastAsia="Calibri" w:hAnsi="Calibri"/>
-          <w:b/>
-          <w:bCs/>
-          <w:sz w:val="22"/>
-          <w:szCs w:val="22"/>
-        </w:rPr>
-        <w:t xml:space="preserve">Con dos frases se arregla</w:t>
-      </w:r>
-      <w:r>
-        <w:rPr>
-          <w:rFonts w:ascii="Calibri" w:cs="Calibri" w:eastAsia="Calibri" w:hAnsi="Calibri"/>
-          <w:b w:val="false"/>
-          <w:bCs w:val="false"/>
-          <w:sz w:val="22"/>
-          <w:szCs w:val="22"/>
-        </w:rPr>
-        <w:t xml:space="preserve">, y van justo antes del remate:</w:t>
-      </w:r>
-    </w:p>
-    <w:p>
-      <w:pPr>
-        <w:pBdr>
-          <w:left w:val="single" w:color="1F3864" w:sz="18" w:space="12"/>
-        </w:pBdr>
-        <w:spacing w:after="200" w:before="120" w:line="360"/>
-        <w:ind w:left="420" w:right="340"/>
-      </w:pPr>
-      <w:r>
-        <w:rPr>
-          <w:rFonts w:ascii="Calibri" w:cs="Calibri" w:eastAsia="Calibri" w:hAnsi="Calibri"/>
-          <w:b w:val="false"/>
-          <w:bCs w:val="false"/>
-          <w:sz w:val="26"/>
-          <w:szCs w:val="26"/>
-        </w:rPr>
-        <w:t xml:space="preserve">Y termino con lo práctico. Ese mismo día, en esa misma sesión, van dos proyectos: uno prohíbe y el otro regula.  </w:t>
-      </w:r>
-      <w:r>
-        <w:rPr>
-          <w:rFonts w:ascii="Calibri" w:cs="Calibri" w:eastAsia="Calibri" w:hAnsi="Calibri"/>
-          <w:b/>
-          <w:bCs/>
-          <w:sz w:val="26"/>
-          <w:szCs w:val="26"/>
-        </w:rPr>
-        <w:t xml:space="preserve">Rechaza el que prohíbe. Y aprueba el que regula.</w:t>
-      </w:r>
-      <w:r>
-        <w:rPr>
-          <w:rFonts w:ascii="Calibri" w:cs="Calibri" w:eastAsia="Calibri" w:hAnsi="Calibri"/>
-          <w:b w:val="false"/>
-          <w:bCs w:val="false"/>
-          <w:sz w:val="26"/>
-          <w:szCs w:val="26"/>
-        </w:rPr>
-        <w:t xml:space="preserve"> Así no votas contra nadie: votas a favor de que haya veterinario obligatorio, control de dopaje y clausura para el que no cumpla.</w:t>
+        <w:t xml:space="preserve">1. El hueco quedó cerrado</w:t>
+      </w:r>
+    </w:p>
+    <w:p>
+      <w:pPr>
+        <w:spacing w:after="280" w:before="0" w:line="420"/>
+      </w:pPr>
+      <w:r>
+        <w:rPr>
+          <w:rFonts w:ascii="Calibri" w:cs="Calibri" w:eastAsia="Calibri" w:hAnsi="Calibri"/>
+          <w:b w:val="false"/>
+          <w:bCs w:val="false"/>
+          <w:sz w:val="22"/>
+          <w:szCs w:val="22"/>
+        </w:rPr>
+        <w:t xml:space="preserve">Faltaba la petición: el video convencía y no pedía nada. Con tu frase quedó resuelto, y quedó mejor de lo que yo lo tenía.</w:t>
+      </w:r>
+    </w:p>
+    <w:p>
+      <w:pPr>
+        <w:spacing w:after="280" w:before="0" w:line="420"/>
+      </w:pPr>
+      <w:r>
+        <w:rPr>
+          <w:rFonts w:ascii="Calibri" w:cs="Calibri" w:eastAsia="Calibri" w:hAnsi="Calibri"/>
+          <w:b/>
+          <w:bCs/>
+          <w:sz w:val="22"/>
+          <w:szCs w:val="22"/>
+        </w:rPr>
+        <w:t xml:space="preserve">«Regula para asegurar el bienestar de los perritos. Y rechaza prohibir.»</w:t>
+      </w:r>
+    </w:p>
+    <w:p>
+      <w:pPr>
+        <w:spacing w:after="280" w:before="0" w:line="420"/>
+      </w:pPr>
+      <w:r>
+        <w:rPr>
+          <w:rFonts w:ascii="Calibri" w:cs="Calibri" w:eastAsia="Calibri" w:hAnsi="Calibri"/>
+          <w:b w:val="false"/>
+          <w:bCs w:val="false"/>
+          <w:sz w:val="22"/>
+          <w:szCs w:val="22"/>
+        </w:rPr>
+        <w:t xml:space="preserve">Da vuelta el argumento entero. Toda la campaña se apoya en que quien defiende las carreras está contra los perros. Esa frase dice lo contrario, y en el mismo idioma que ellos usan: </w:t>
+      </w:r>
+      <w:r>
+        <w:rPr>
+          <w:rFonts w:ascii="Calibri" w:cs="Calibri" w:eastAsia="Calibri" w:hAnsi="Calibri"/>
+          <w:b/>
+          <w:bCs/>
+          <w:sz w:val="22"/>
+          <w:szCs w:val="22"/>
+        </w:rPr>
+        <w:t xml:space="preserve">el que vota regular es el que está cuidando a los perros; el que prohíbe los manda a donde nadie los mira.</w:t>
+      </w:r>
+    </w:p>
+    <w:p>
+      <w:pPr>
+        <w:spacing w:after="280" w:before="0" w:line="420"/>
+      </w:pPr>
+      <w:r>
+        <w:rPr>
+          <w:rFonts w:ascii="Calibri" w:cs="Calibri" w:eastAsia="Calibri" w:hAnsi="Calibri"/>
+          <w:b w:val="false"/>
+          <w:bCs w:val="false"/>
+          <w:sz w:val="22"/>
+          <w:szCs w:val="22"/>
+        </w:rPr>
+        <w:t xml:space="preserve">Va antes del remate, y la repito en tres palabras como última frase del video, para que sea lo último que quede sonando.</w:t>
       </w:r>
     </w:p>
     <w:p>
@@ -1086,7 +1086,7 @@
           <w:sz w:val="22"/>
           <w:szCs w:val="22"/>
         </w:rPr>
-        <w:t xml:space="preserve">≈ 4 min 45 s. Con las dos frases de la petición, ≈ 5 min.</w:t>
+        <w:t xml:space="preserve">≈ 5 minutos.</w:t>
       </w:r>
     </w:p>
     <w:p>

</xml_diff>

<commit_message>
Fija la frase de cierre y la sitúa como última del video
El autor precisa el remate: rechazar la prohibición y su desamparo. La
palabra nombra lo que la prohibición produce sobre el animal, no sobre quien
lo corre, que es lo que le importa a quien vota: sin veterinario, sin chip,
sin reglamento y sin nadie a quien reclamarle.

La frase queda como última del video, después del remate emocional. En una
pieza cuyo objeto es un voto, la instrucción debe ser lo último que se oye.

Co-Authored-By: Claude Opus 5 <noreply@anthropic.com>
Claude-Session: https://claude.ai/code/session_01AaVqn5UHdydzFXx9WZark1
</commit_message>
<xml_diff>
--- a/03-borradores/Video-completo-unificado.docx
+++ b/03-borradores/Video-completo-unificado.docx
@@ -628,21 +628,6 @@
       <w:r>
         <w:rPr>
           <w:rFonts w:ascii="Calibri" w:cs="Calibri" w:eastAsia="Calibri" w:hAnsi="Calibri"/>
-          <w:b/>
-          <w:bCs/>
-          <w:sz w:val="34"/>
-          <w:szCs w:val="34"/>
-        </w:rPr>
-        <w:t xml:space="preserve">Regula para asegurar el bienestar de los perritos. Y rechaza prohibir.</w:t>
-      </w:r>
-    </w:p>
-    <w:p>
-      <w:pPr>
-        <w:spacing w:after="280" w:before="0" w:line="420"/>
-      </w:pPr>
-      <w:r>
-        <w:rPr>
-          <w:rFonts w:ascii="Calibri" w:cs="Calibri" w:eastAsia="Calibri" w:hAnsi="Calibri"/>
           <w:b w:val="false"/>
           <w:bCs w:val="false"/>
           <w:sz w:val="34"/>
@@ -732,17 +717,51 @@
     </w:p>
     <w:p>
       <w:pPr>
-        <w:spacing w:after="280" w:before="0" w:line="420"/>
-      </w:pPr>
-      <w:r>
-        <w:rPr>
-          <w:rFonts w:ascii="Calibri" w:cs="Calibri" w:eastAsia="Calibri" w:hAnsi="Calibri"/>
-          <w:b/>
-          <w:bCs/>
-          <w:sz w:val="34"/>
-          <w:szCs w:val="34"/>
-        </w:rPr>
-        <w:t xml:space="preserve">Regula. Y rechaza prohibir.</w:t>
+        <w:pBdr>
+          <w:bottom w:val="single" w:color="1F3864" w:sz="8" w:space="4"/>
+        </w:pBdr>
+        <w:spacing w:after="200" w:before="340"/>
+      </w:pPr>
+      <w:r>
+        <w:rPr>
+          <w:rFonts w:ascii="Calibri" w:cs="Calibri" w:eastAsia="Calibri" w:hAnsi="Calibri"/>
+          <w:b/>
+          <w:bCs/>
+          <w:color w:val="1F3864"/>
+          <w:sz w:val="26"/>
+          <w:szCs w:val="26"/>
+        </w:rPr>
+        <w:t xml:space="preserve">VII · La última frase</w:t>
+      </w:r>
+    </w:p>
+    <w:p>
+      <w:pPr>
+        <w:spacing w:after="280" w:before="0" w:line="420"/>
+      </w:pPr>
+      <w:r>
+        <w:rPr>
+          <w:rFonts w:ascii="Calibri" w:cs="Calibri" w:eastAsia="Calibri" w:hAnsi="Calibri"/>
+          <w:b/>
+          <w:bCs/>
+          <w:sz w:val="34"/>
+          <w:szCs w:val="34"/>
+        </w:rPr>
+        <w:t xml:space="preserve">Regula para asegurar el bienestar de los perritos.</w:t>
+      </w:r>
+    </w:p>
+    <w:p>
+      <w:pPr>
+        <w:spacing w:after="280" w:before="0" w:line="420"/>
+      </w:pPr>
+      <w:r>
+        <w:rPr>
+          <w:rFonts w:ascii="Calibri" w:cs="Calibri" w:eastAsia="Calibri" w:hAnsi="Calibri"/>
+          <w:b/>
+          <w:bCs/>
+          <w:sz w:val="34"/>
+          <w:szCs w:val="34"/>
+        </w:rPr>
+        <w:t xml:space="preserve">Y rechaza la prohibición y su desamparo.</w:t>
       </w:r>
     </w:p>
     <w:p>
@@ -830,7 +849,7 @@
           <w:sz w:val="22"/>
           <w:szCs w:val="22"/>
         </w:rPr>
-        <w:t xml:space="preserve">«Regula para asegurar el bienestar de los perritos. Y rechaza prohibir.»</w:t>
+        <w:t xml:space="preserve">«Regula para asegurar el bienestar de los perritos. Y rechaza la prohibición y su desamparo.»</w:t>
       </w:r>
     </w:p>
     <w:p>
@@ -870,7 +889,62 @@
           <w:sz w:val="22"/>
           <w:szCs w:val="22"/>
         </w:rPr>
-        <w:t xml:space="preserve">Va antes del remate, y la repito en tres palabras como última frase del video, para que sea lo último que quede sonando.</w:t>
+        <w:t xml:space="preserve">Y «desamparo» es la palabra exacta. No dice que prohibir sea injusto con los galgueros —eso al diputado le da lo mismo—: dice qué le pasa </w:t>
+      </w:r>
+      <w:r>
+        <w:rPr>
+          <w:rFonts w:ascii="Calibri" w:cs="Calibri" w:eastAsia="Calibri" w:hAnsi="Calibri"/>
+          <w:b/>
+          <w:bCs/>
+          <w:sz w:val="22"/>
+          <w:szCs w:val="22"/>
+        </w:rPr>
+        <w:t xml:space="preserve">al perro</w:t>
+      </w:r>
+      <w:r>
+        <w:rPr>
+          <w:rFonts w:ascii="Calibri" w:cs="Calibri" w:eastAsia="Calibri" w:hAnsi="Calibri"/>
+          <w:b w:val="false"/>
+          <w:bCs w:val="false"/>
+          <w:sz w:val="22"/>
+          <w:szCs w:val="22"/>
+        </w:rPr>
+        <w:t xml:space="preserve">. Se queda sin veterinario, sin chip, sin reglamento y sin nadie a quien reclamarle. Eso es desamparo, y es literalmente lo que ocurre.</w:t>
+      </w:r>
+    </w:p>
+    <w:p>
+      <w:pPr>
+        <w:spacing w:after="280" w:before="0" w:line="420"/>
+      </w:pPr>
+      <w:r>
+        <w:rPr>
+          <w:rFonts w:ascii="Calibri" w:cs="Calibri" w:eastAsia="Calibri" w:hAnsi="Calibri"/>
+          <w:b w:val="false"/>
+          <w:bCs w:val="false"/>
+          <w:sz w:val="22"/>
+          <w:szCs w:val="22"/>
+        </w:rPr>
+        <w:t xml:space="preserve">Queda como </w:t>
+      </w:r>
+      <w:r>
+        <w:rPr>
+          <w:rFonts w:ascii="Calibri" w:cs="Calibri" w:eastAsia="Calibri" w:hAnsi="Calibri"/>
+          <w:b/>
+          <w:bCs/>
+          <w:sz w:val="22"/>
+          <w:szCs w:val="22"/>
+        </w:rPr>
+        <w:t xml:space="preserve">la última frase del video</w:t>
+      </w:r>
+      <w:r>
+        <w:rPr>
+          <w:rFonts w:ascii="Calibri" w:cs="Calibri" w:eastAsia="Calibri" w:hAnsi="Calibri"/>
+          <w:b w:val="false"/>
+          <w:bCs w:val="false"/>
+          <w:sz w:val="22"/>
+          <w:szCs w:val="22"/>
+        </w:rPr>
+        <w:t xml:space="preserve">, después del remate. Es lo correcto: en una pieza cuyo objetivo es un voto, la instrucción tiene que ser lo último que se oye.</w:t>
       </w:r>
     </w:p>
     <w:p>

</xml_diff>